<commit_message>
update repherat and menu
</commit_message>
<xml_diff>
--- a/О.docx
+++ b/О.docx
@@ -63,6 +63,8 @@
         <w:spacing w:after="0"/>
         <w:rPr>
           <w:rFonts w:ascii="Times New Roman" w:hAnsi="Times New Roman" w:cs="Times New Roman"/>
+          <w:i/>
+          <w:iCs/>
           <w:lang w:val="ru-RU"/>
         </w:rPr>
       </w:pPr>
@@ -81,6 +83,128 @@
           <w:lang w:val="ru-RU"/>
         </w:rPr>
         <w:t xml:space="preserve"> </w:t>
+      </w:r>
+    </w:p>
+    <w:p>
+      <w:pPr>
+        <w:spacing w:after="0"/>
+        <w:rPr>
+          <w:rFonts w:ascii="Times New Roman" w:hAnsi="Times New Roman" w:cs="Times New Roman"/>
+          <w:lang w:val="ru-RU"/>
+        </w:rPr>
+      </w:pPr>
+      <w:r>
+        <w:rPr>
+          <w:rFonts w:ascii="Times New Roman" w:hAnsi="Times New Roman" w:cs="Times New Roman"/>
+          <w:lang w:val="ru-RU"/>
+        </w:rPr>
+        <w:t>1.</w:t>
+      </w:r>
+      <w:r>
+        <w:rPr>
+          <w:rFonts w:ascii="Times New Roman" w:hAnsi="Times New Roman" w:cs="Times New Roman"/>
+          <w:lang w:val="ru-RU"/>
+        </w:rPr>
+        <w:t>1</w:t>
+      </w:r>
+      <w:r>
+        <w:rPr>
+          <w:rFonts w:ascii="Times New Roman" w:hAnsi="Times New Roman" w:cs="Times New Roman"/>
+          <w:lang w:val="vi-VN"/>
+        </w:rPr>
+        <w:t>.</w:t>
+      </w:r>
+      <w:r>
+        <w:rPr>
+          <w:rFonts w:ascii="Times New Roman" w:hAnsi="Times New Roman" w:cs="Times New Roman"/>
+          <w:lang w:val="ru-RU"/>
+        </w:rPr>
+        <w:t xml:space="preserve"> </w:t>
+      </w:r>
+      <w:r>
+        <w:rPr>
+          <w:rFonts w:ascii="Times New Roman" w:hAnsi="Times New Roman" w:cs="Times New Roman"/>
+          <w:lang w:val="ru-RU"/>
+        </w:rPr>
+        <w:t>Фальсификация изображений и задач</w:t>
+      </w:r>
+      <w:r>
+        <w:rPr>
+          <w:rFonts w:ascii="Times New Roman" w:hAnsi="Times New Roman" w:cs="Times New Roman"/>
+          <w:lang w:val="ru-RU"/>
+        </w:rPr>
+        <w:t>а</w:t>
+      </w:r>
+      <w:r>
+        <w:rPr>
+          <w:rFonts w:ascii="Times New Roman" w:hAnsi="Times New Roman" w:cs="Times New Roman"/>
+          <w:lang w:val="ru-RU"/>
+        </w:rPr>
+        <w:t xml:space="preserve"> </w:t>
+      </w:r>
+      <w:r>
+        <w:rPr>
+          <w:rFonts w:ascii="Times New Roman" w:hAnsi="Times New Roman" w:cs="Times New Roman"/>
+          <w:lang w:val="ru-RU"/>
+        </w:rPr>
+        <w:t>её</w:t>
+      </w:r>
+      <w:r>
+        <w:rPr>
+          <w:rFonts w:ascii="Times New Roman" w:hAnsi="Times New Roman" w:cs="Times New Roman"/>
+          <w:lang w:val="ru-RU"/>
+        </w:rPr>
+        <w:t xml:space="preserve"> обнаружения</w:t>
+      </w:r>
+      <w:r>
+        <w:rPr>
+          <w:rFonts w:ascii="Times New Roman" w:hAnsi="Times New Roman" w:cs="Times New Roman"/>
+          <w:i/>
+          <w:iCs/>
+          <w:lang w:val="ru-RU"/>
+        </w:rPr>
+        <w:t xml:space="preserve"> </w:t>
+      </w:r>
+    </w:p>
+    <w:p>
+      <w:pPr>
+        <w:pStyle w:val="ListParagraph"/>
+        <w:numPr>
+          <w:ilvl w:val="2"/>
+          <w:numId w:val="1"/>
+        </w:numPr>
+        <w:spacing w:after="0"/>
+        <w:rPr>
+          <w:rFonts w:ascii="Times New Roman" w:hAnsi="Times New Roman" w:cs="Times New Roman"/>
+        </w:rPr>
+      </w:pPr>
+      <w:r>
+        <w:rPr>
+          <w:rFonts w:ascii="Times New Roman" w:hAnsi="Times New Roman" w:cs="Times New Roman"/>
+          <w:lang w:val="ru-RU"/>
+        </w:rPr>
+        <w:t xml:space="preserve">Понятие фальсификации изображений </w:t>
+      </w:r>
+    </w:p>
+    <w:p>
+      <w:pPr>
+        <w:pStyle w:val="ListParagraph"/>
+        <w:numPr>
+          <w:ilvl w:val="2"/>
+          <w:numId w:val="1"/>
+        </w:numPr>
+        <w:spacing w:after="0"/>
+        <w:rPr>
+          <w:rFonts w:ascii="Times New Roman" w:hAnsi="Times New Roman" w:cs="Times New Roman"/>
+          <w:lang w:val="ru-RU"/>
+        </w:rPr>
+      </w:pPr>
+      <w:r>
+        <w:rPr>
+          <w:rFonts w:ascii="Times New Roman" w:hAnsi="Times New Roman" w:cs="Times New Roman"/>
+          <w:lang w:val="ru-RU"/>
+        </w:rPr>
+        <w:t>Основные трудности и требования к методам обнаружения</w:t>
       </w:r>
     </w:p>
     <w:p>
@@ -93,14 +217,36 @@
         <w:spacing w:after="0"/>
         <w:rPr>
           <w:rFonts w:ascii="Times New Roman" w:hAnsi="Times New Roman" w:cs="Times New Roman"/>
-        </w:rPr>
-      </w:pPr>
-      <w:r>
-        <w:rPr>
-          <w:rFonts w:ascii="Times New Roman" w:hAnsi="Times New Roman" w:cs="Times New Roman"/>
-          <w:lang w:val="ru-RU"/>
-        </w:rPr>
-        <w:t xml:space="preserve">Анализ предметной области </w:t>
+          <w:lang w:val="ru-RU"/>
+        </w:rPr>
+      </w:pPr>
+      <w:r>
+        <w:rPr>
+          <w:rFonts w:ascii="Times New Roman" w:hAnsi="Times New Roman" w:cs="Times New Roman"/>
+          <w:lang w:val="ru-RU"/>
+        </w:rPr>
+        <w:t>М</w:t>
+      </w:r>
+      <w:r>
+        <w:rPr>
+          <w:rFonts w:ascii="Times New Roman" w:hAnsi="Times New Roman" w:cs="Times New Roman"/>
+          <w:lang w:val="ru-RU"/>
+        </w:rPr>
+        <w:t>етод</w:t>
+      </w:r>
+      <w:r>
+        <w:rPr>
+          <w:rFonts w:ascii="Times New Roman" w:hAnsi="Times New Roman" w:cs="Times New Roman"/>
+          <w:lang w:val="ru-RU"/>
+        </w:rPr>
+        <w:t>ы</w:t>
+      </w:r>
+      <w:r>
+        <w:rPr>
+          <w:rFonts w:ascii="Times New Roman" w:hAnsi="Times New Roman" w:cs="Times New Roman"/>
+          <w:lang w:val="ru-RU"/>
+        </w:rPr>
+        <w:t xml:space="preserve"> обнаружения фальсифицированного фрагмента на изображении </w:t>
       </w:r>
     </w:p>
     <w:p>
@@ -113,14 +259,36 @@
         <w:spacing w:after="0"/>
         <w:rPr>
           <w:rFonts w:ascii="Times New Roman" w:hAnsi="Times New Roman" w:cs="Times New Roman"/>
-        </w:rPr>
-      </w:pPr>
-      <w:r>
-        <w:rPr>
-          <w:rFonts w:ascii="Times New Roman" w:hAnsi="Times New Roman" w:cs="Times New Roman"/>
-          <w:lang w:val="ru-RU"/>
-        </w:rPr>
-        <w:t xml:space="preserve">Понятие фальсификации изображений </w:t>
+          <w:lang w:val="ru-RU"/>
+        </w:rPr>
+      </w:pPr>
+      <w:r>
+        <w:rPr>
+          <w:rFonts w:ascii="Times New Roman" w:hAnsi="Times New Roman" w:cs="Times New Roman"/>
+          <w:lang w:val="ru-RU"/>
+        </w:rPr>
+        <w:t xml:space="preserve">Метод </w:t>
+      </w:r>
+      <w:r>
+        <w:rPr>
+          <w:rFonts w:ascii="Times New Roman" w:hAnsi="Times New Roman" w:cs="Times New Roman"/>
+          <w:lang w:val="ru-RU"/>
+        </w:rPr>
+        <w:t>на основе анализа</w:t>
+      </w:r>
+      <w:r>
+        <w:rPr>
+          <w:rFonts w:ascii="Times New Roman" w:hAnsi="Times New Roman" w:cs="Times New Roman"/>
+          <w:lang w:val="ru-RU"/>
+        </w:rPr>
+        <w:t xml:space="preserve"> </w:t>
+      </w:r>
+      <w:r>
+        <w:rPr>
+          <w:rFonts w:ascii="Times New Roman" w:hAnsi="Times New Roman" w:cs="Times New Roman"/>
+          <w:lang w:val="ru-RU"/>
+        </w:rPr>
+        <w:t>целостности изображений</w:t>
       </w:r>
     </w:p>
     <w:p>
@@ -141,7 +309,63 @@
           <w:rFonts w:ascii="Times New Roman" w:hAnsi="Times New Roman" w:cs="Times New Roman"/>
           <w:lang w:val="ru-RU"/>
         </w:rPr>
-        <w:t>Основные трудности и требования к методам обнаружения</w:t>
+        <w:t>Метод поиска ключевых точек</w:t>
+      </w:r>
+    </w:p>
+    <w:p>
+      <w:pPr>
+        <w:pStyle w:val="ListParagraph"/>
+        <w:numPr>
+          <w:ilvl w:val="2"/>
+          <w:numId w:val="1"/>
+        </w:numPr>
+        <w:spacing w:after="0"/>
+        <w:rPr>
+          <w:rFonts w:ascii="Times New Roman" w:hAnsi="Times New Roman" w:cs="Times New Roman"/>
+          <w:lang w:val="ru-RU"/>
+        </w:rPr>
+      </w:pPr>
+      <w:r>
+        <w:rPr>
+          <w:rFonts w:ascii="Times New Roman" w:hAnsi="Times New Roman" w:cs="Times New Roman"/>
+          <w:lang w:val="ru-RU"/>
+        </w:rPr>
+        <w:t xml:space="preserve">Методы на основе </w:t>
+      </w:r>
+      <w:r>
+        <w:rPr>
+          <w:rFonts w:ascii="Times New Roman" w:hAnsi="Times New Roman" w:cs="Times New Roman"/>
+          <w:lang w:val="ru-RU"/>
+        </w:rPr>
+        <w:t xml:space="preserve">сверточной </w:t>
+      </w:r>
+      <w:r>
+        <w:rPr>
+          <w:rFonts w:ascii="Times New Roman" w:hAnsi="Times New Roman" w:cs="Times New Roman"/>
+          <w:lang w:val="ru-RU"/>
+        </w:rPr>
+        <w:t>нейронн</w:t>
+      </w:r>
+      <w:r>
+        <w:rPr>
+          <w:rFonts w:ascii="Times New Roman" w:hAnsi="Times New Roman" w:cs="Times New Roman"/>
+          <w:lang w:val="ru-RU"/>
+        </w:rPr>
+        <w:t>ой</w:t>
+      </w:r>
+      <w:r>
+        <w:rPr>
+          <w:rFonts w:ascii="Times New Roman" w:hAnsi="Times New Roman" w:cs="Times New Roman"/>
+          <w:lang w:val="ru-RU"/>
+        </w:rPr>
+        <w:t xml:space="preserve"> сет</w:t>
+      </w:r>
+      <w:r>
+        <w:rPr>
+          <w:rFonts w:ascii="Times New Roman" w:hAnsi="Times New Roman" w:cs="Times New Roman"/>
+          <w:lang w:val="ru-RU"/>
+        </w:rPr>
+        <w:t>и</w:t>
       </w:r>
     </w:p>
     <w:p>
@@ -162,28 +386,14 @@
           <w:rFonts w:ascii="Times New Roman" w:hAnsi="Times New Roman" w:cs="Times New Roman"/>
           <w:lang w:val="ru-RU"/>
         </w:rPr>
-        <w:t>М</w:t>
-      </w:r>
-      <w:r>
-        <w:rPr>
-          <w:rFonts w:ascii="Times New Roman" w:hAnsi="Times New Roman" w:cs="Times New Roman"/>
-          <w:lang w:val="ru-RU"/>
-        </w:rPr>
-        <w:t>етод</w:t>
-      </w:r>
-      <w:r>
-        <w:rPr>
-          <w:rFonts w:ascii="Times New Roman" w:hAnsi="Times New Roman" w:cs="Times New Roman"/>
-          <w:lang w:val="ru-RU"/>
-        </w:rPr>
-        <w:t>ы</w:t>
-      </w:r>
-      <w:r>
-        <w:rPr>
-          <w:rFonts w:ascii="Times New Roman" w:hAnsi="Times New Roman" w:cs="Times New Roman"/>
-          <w:lang w:val="ru-RU"/>
-        </w:rPr>
-        <w:t xml:space="preserve"> обнаружения фальсифицированного фрагмента на изображении </w:t>
+        <w:t xml:space="preserve">Сравнительный анализ </w:t>
+      </w:r>
+      <w:r>
+        <w:rPr>
+          <w:rFonts w:ascii="Times New Roman" w:hAnsi="Times New Roman" w:cs="Times New Roman"/>
+          <w:lang w:val="ru-RU"/>
+        </w:rPr>
+        <w:t>методов фальсифицированного фрагмента на изображении</w:t>
       </w:r>
     </w:p>
     <w:p>
@@ -204,28 +414,7 @@
           <w:rFonts w:ascii="Times New Roman" w:hAnsi="Times New Roman" w:cs="Times New Roman"/>
           <w:lang w:val="ru-RU"/>
         </w:rPr>
-        <w:t xml:space="preserve">Метод </w:t>
-      </w:r>
-      <w:r>
-        <w:rPr>
-          <w:rFonts w:ascii="Times New Roman" w:hAnsi="Times New Roman" w:cs="Times New Roman"/>
-          <w:lang w:val="ru-RU"/>
-        </w:rPr>
-        <w:t>на основе анализа</w:t>
-      </w:r>
-      <w:r>
-        <w:rPr>
-          <w:rFonts w:ascii="Times New Roman" w:hAnsi="Times New Roman" w:cs="Times New Roman"/>
-          <w:lang w:val="ru-RU"/>
-        </w:rPr>
-        <w:t xml:space="preserve"> </w:t>
-      </w:r>
-      <w:r>
-        <w:rPr>
-          <w:rFonts w:ascii="Times New Roman" w:hAnsi="Times New Roman" w:cs="Times New Roman"/>
-          <w:lang w:val="ru-RU"/>
-        </w:rPr>
-        <w:t>целостности изображений</w:t>
+        <w:t>Обоснование критериев сравнения методов</w:t>
       </w:r>
     </w:p>
     <w:p>
@@ -246,153 +435,6 @@
           <w:rFonts w:ascii="Times New Roman" w:hAnsi="Times New Roman" w:cs="Times New Roman"/>
           <w:lang w:val="ru-RU"/>
         </w:rPr>
-        <w:t xml:space="preserve">Метод </w:t>
-      </w:r>
-      <w:r>
-        <w:rPr>
-          <w:rFonts w:ascii="Times New Roman" w:hAnsi="Times New Roman" w:cs="Times New Roman"/>
-          <w:lang w:val="ru-RU"/>
-        </w:rPr>
-        <w:t>поиска ключевых</w:t>
-      </w:r>
-      <w:r>
-        <w:rPr>
-          <w:rFonts w:ascii="Times New Roman" w:hAnsi="Times New Roman" w:cs="Times New Roman"/>
-          <w:lang w:val="ru-RU"/>
-        </w:rPr>
-        <w:t xml:space="preserve"> точек</w:t>
-      </w:r>
-    </w:p>
-    <w:p>
-      <w:pPr>
-        <w:pStyle w:val="ListParagraph"/>
-        <w:numPr>
-          <w:ilvl w:val="2"/>
-          <w:numId w:val="1"/>
-        </w:numPr>
-        <w:spacing w:after="0"/>
-        <w:rPr>
-          <w:rFonts w:ascii="Times New Roman" w:hAnsi="Times New Roman" w:cs="Times New Roman"/>
-          <w:lang w:val="ru-RU"/>
-        </w:rPr>
-      </w:pPr>
-      <w:r>
-        <w:rPr>
-          <w:rFonts w:ascii="Times New Roman" w:hAnsi="Times New Roman" w:cs="Times New Roman"/>
-          <w:lang w:val="ru-RU"/>
-        </w:rPr>
-        <w:t xml:space="preserve">Методы на основе </w:t>
-      </w:r>
-      <w:r>
-        <w:rPr>
-          <w:rFonts w:ascii="Times New Roman" w:hAnsi="Times New Roman" w:cs="Times New Roman"/>
-          <w:lang w:val="ru-RU"/>
-        </w:rPr>
-        <w:t xml:space="preserve">сверточной </w:t>
-      </w:r>
-      <w:r>
-        <w:rPr>
-          <w:rFonts w:ascii="Times New Roman" w:hAnsi="Times New Roman" w:cs="Times New Roman"/>
-          <w:lang w:val="ru-RU"/>
-        </w:rPr>
-        <w:t>нейронн</w:t>
-      </w:r>
-      <w:r>
-        <w:rPr>
-          <w:rFonts w:ascii="Times New Roman" w:hAnsi="Times New Roman" w:cs="Times New Roman"/>
-          <w:lang w:val="ru-RU"/>
-        </w:rPr>
-        <w:t>ой</w:t>
-      </w:r>
-      <w:r>
-        <w:rPr>
-          <w:rFonts w:ascii="Times New Roman" w:hAnsi="Times New Roman" w:cs="Times New Roman"/>
-          <w:lang w:val="ru-RU"/>
-        </w:rPr>
-        <w:t xml:space="preserve"> сет</w:t>
-      </w:r>
-      <w:r>
-        <w:rPr>
-          <w:rFonts w:ascii="Times New Roman" w:hAnsi="Times New Roman" w:cs="Times New Roman"/>
-          <w:lang w:val="ru-RU"/>
-        </w:rPr>
-        <w:t>и</w:t>
-      </w:r>
-    </w:p>
-    <w:p>
-      <w:pPr>
-        <w:pStyle w:val="ListParagraph"/>
-        <w:numPr>
-          <w:ilvl w:val="1"/>
-          <w:numId w:val="1"/>
-        </w:numPr>
-        <w:spacing w:after="0"/>
-        <w:rPr>
-          <w:rFonts w:ascii="Times New Roman" w:hAnsi="Times New Roman" w:cs="Times New Roman"/>
-          <w:lang w:val="ru-RU"/>
-        </w:rPr>
-      </w:pPr>
-      <w:r>
-        <w:rPr>
-          <w:rFonts w:ascii="Times New Roman" w:hAnsi="Times New Roman" w:cs="Times New Roman"/>
-          <w:lang w:val="ru-RU"/>
-        </w:rPr>
-        <w:t xml:space="preserve">Сравнительный анализ </w:t>
-      </w:r>
-      <w:r>
-        <w:rPr>
-          <w:rFonts w:ascii="Times New Roman" w:hAnsi="Times New Roman" w:cs="Times New Roman"/>
-          <w:lang w:val="ru-RU"/>
-        </w:rPr>
-        <w:t xml:space="preserve">методов </w:t>
-      </w:r>
-      <w:r>
-        <w:rPr>
-          <w:rFonts w:ascii="Times New Roman" w:hAnsi="Times New Roman" w:cs="Times New Roman"/>
-          <w:lang w:val="ru-RU"/>
-        </w:rPr>
-        <w:t>фальсифицированного фрагмента на изображении</w:t>
-      </w:r>
-    </w:p>
-    <w:p>
-      <w:pPr>
-        <w:pStyle w:val="ListParagraph"/>
-        <w:numPr>
-          <w:ilvl w:val="2"/>
-          <w:numId w:val="1"/>
-        </w:numPr>
-        <w:spacing w:after="0"/>
-        <w:rPr>
-          <w:rFonts w:ascii="Times New Roman" w:hAnsi="Times New Roman" w:cs="Times New Roman"/>
-          <w:lang w:val="ru-RU"/>
-        </w:rPr>
-      </w:pPr>
-      <w:r>
-        <w:rPr>
-          <w:rFonts w:ascii="Times New Roman" w:hAnsi="Times New Roman" w:cs="Times New Roman"/>
-          <w:lang w:val="ru-RU"/>
-        </w:rPr>
-        <w:t>Обоснование критериев сравнения методов</w:t>
-      </w:r>
-    </w:p>
-    <w:p>
-      <w:pPr>
-        <w:pStyle w:val="ListParagraph"/>
-        <w:numPr>
-          <w:ilvl w:val="2"/>
-          <w:numId w:val="1"/>
-        </w:numPr>
-        <w:spacing w:after="0"/>
-        <w:rPr>
-          <w:rFonts w:ascii="Times New Roman" w:hAnsi="Times New Roman" w:cs="Times New Roman"/>
-          <w:lang w:val="ru-RU"/>
-        </w:rPr>
-      </w:pPr>
-      <w:r>
-        <w:rPr>
-          <w:rFonts w:ascii="Times New Roman" w:hAnsi="Times New Roman" w:cs="Times New Roman"/>
-          <w:lang w:val="ru-RU"/>
-        </w:rPr>
         <w:t>Таблица сравнения методов</w:t>
       </w:r>
     </w:p>
@@ -568,14 +610,42 @@
           <w:rFonts w:ascii="Times New Roman" w:hAnsi="Times New Roman" w:cs="Times New Roman"/>
           <w:lang w:val="ru-RU"/>
         </w:rPr>
-        <w:t>Предобработка</w:t>
-      </w:r>
-      <w:r>
-        <w:rPr>
-          <w:rFonts w:ascii="Times New Roman" w:hAnsi="Times New Roman" w:cs="Times New Roman"/>
-          <w:lang w:val="ru-RU"/>
-        </w:rPr>
-        <w:t xml:space="preserve">  и извлечение признаков</w:t>
+        <w:t>Алгоритмы п</w:t>
+      </w:r>
+      <w:r>
+        <w:rPr>
+          <w:rFonts w:ascii="Times New Roman" w:hAnsi="Times New Roman" w:cs="Times New Roman"/>
+          <w:lang w:val="ru-RU"/>
+        </w:rPr>
+        <w:t>редобработк</w:t>
+      </w:r>
+      <w:r>
+        <w:rPr>
+          <w:rFonts w:ascii="Times New Roman" w:hAnsi="Times New Roman" w:cs="Times New Roman"/>
+          <w:lang w:val="ru-RU"/>
+        </w:rPr>
+        <w:t>и</w:t>
+      </w:r>
+      <w:r>
+        <w:rPr>
+          <w:rFonts w:ascii="Times New Roman" w:hAnsi="Times New Roman" w:cs="Times New Roman"/>
+          <w:lang w:val="ru-RU"/>
+        </w:rPr>
+        <w:t xml:space="preserve">  и извлечени</w:t>
+      </w:r>
+      <w:r>
+        <w:rPr>
+          <w:rFonts w:ascii="Times New Roman" w:hAnsi="Times New Roman" w:cs="Times New Roman"/>
+          <w:lang w:val="ru-RU"/>
+        </w:rPr>
+        <w:t>я</w:t>
+      </w:r>
+      <w:r>
+        <w:rPr>
+          <w:rFonts w:ascii="Times New Roman" w:hAnsi="Times New Roman" w:cs="Times New Roman"/>
+          <w:lang w:val="ru-RU"/>
+        </w:rPr>
+        <w:t xml:space="preserve"> признаков</w:t>
       </w:r>
     </w:p>
     <w:p>
@@ -677,7 +747,21 @@
           <w:rFonts w:ascii="Times New Roman" w:hAnsi="Times New Roman" w:cs="Times New Roman"/>
           <w:lang w:val="ru-RU"/>
         </w:rPr>
-        <w:t>Структура разрабатываемого программного обеспечения</w:t>
+        <w:t xml:space="preserve">Проектирование </w:t>
+      </w:r>
+      <w:r>
+        <w:rPr>
+          <w:rFonts w:ascii="Times New Roman" w:hAnsi="Times New Roman" w:cs="Times New Roman"/>
+          <w:lang w:val="ru-RU"/>
+        </w:rPr>
+        <w:t>программного обеспечения</w:t>
+      </w:r>
+      <w:r>
+        <w:rPr>
+          <w:rFonts w:ascii="Times New Roman" w:hAnsi="Times New Roman" w:cs="Times New Roman"/>
+          <w:lang w:val="ru-RU"/>
+        </w:rPr>
+        <w:t xml:space="preserve"> метода</w:t>
       </w:r>
     </w:p>
     <w:p>
@@ -792,7 +876,7 @@
           <w:rFonts w:ascii="Times New Roman" w:hAnsi="Times New Roman" w:cs="Times New Roman"/>
           <w:lang w:val="ru-RU"/>
         </w:rPr>
-        <w:t xml:space="preserve">.1.1. Выбор языка программирования </w:t>
+        <w:t>.2. Формат входных и выходных данных</w:t>
       </w:r>
     </w:p>
     <w:p>
@@ -815,52 +899,6 @@
           <w:rFonts w:ascii="Times New Roman" w:hAnsi="Times New Roman" w:cs="Times New Roman"/>
           <w:lang w:val="ru-RU"/>
         </w:rPr>
-        <w:t xml:space="preserve">.1.2. Выбор среды программирования </w:t>
-      </w:r>
-    </w:p>
-    <w:p>
-      <w:pPr>
-        <w:spacing w:after="0"/>
-        <w:rPr>
-          <w:rFonts w:ascii="Times New Roman" w:hAnsi="Times New Roman" w:cs="Times New Roman"/>
-          <w:lang w:val="ru-RU"/>
-        </w:rPr>
-      </w:pPr>
-      <w:r>
-        <w:rPr>
-          <w:rFonts w:ascii="Times New Roman" w:hAnsi="Times New Roman" w:cs="Times New Roman"/>
-          <w:lang w:val="ru-RU"/>
-        </w:rPr>
-        <w:t>3</w:t>
-      </w:r>
-      <w:r>
-        <w:rPr>
-          <w:rFonts w:ascii="Times New Roman" w:hAnsi="Times New Roman" w:cs="Times New Roman"/>
-          <w:lang w:val="ru-RU"/>
-        </w:rPr>
-        <w:t>.2. Формат входных и выходных данных</w:t>
-      </w:r>
-    </w:p>
-    <w:p>
-      <w:pPr>
-        <w:spacing w:after="0"/>
-        <w:rPr>
-          <w:rFonts w:ascii="Times New Roman" w:hAnsi="Times New Roman" w:cs="Times New Roman"/>
-          <w:lang w:val="ru-RU"/>
-        </w:rPr>
-      </w:pPr>
-      <w:r>
-        <w:rPr>
-          <w:rFonts w:ascii="Times New Roman" w:hAnsi="Times New Roman" w:cs="Times New Roman"/>
-          <w:lang w:val="ru-RU"/>
-        </w:rPr>
-        <w:t>3</w:t>
-      </w:r>
-      <w:r>
-        <w:rPr>
-          <w:rFonts w:ascii="Times New Roman" w:hAnsi="Times New Roman" w:cs="Times New Roman"/>
-          <w:lang w:val="ru-RU"/>
-        </w:rPr>
         <w:t xml:space="preserve">.3. </w:t>
       </w:r>
       <w:r>
@@ -868,7 +906,14 @@
           <w:rFonts w:ascii="Times New Roman" w:hAnsi="Times New Roman" w:cs="Times New Roman"/>
           <w:lang w:val="ru-RU"/>
         </w:rPr>
-        <w:t xml:space="preserve">Схема </w:t>
+        <w:t>Структура</w:t>
+      </w:r>
+      <w:r>
+        <w:rPr>
+          <w:rFonts w:ascii="Times New Roman" w:hAnsi="Times New Roman" w:cs="Times New Roman"/>
+          <w:lang w:val="ru-RU"/>
+        </w:rPr>
+        <w:t xml:space="preserve"> </w:t>
       </w:r>
       <w:r>
         <w:rPr>
@@ -1101,7 +1146,86 @@
           <w:rFonts w:ascii="Times New Roman" w:hAnsi="Times New Roman" w:cs="Times New Roman"/>
           <w:lang w:val="ru-RU"/>
         </w:rPr>
-        <w:t xml:space="preserve">Влияние качества изображения на качество модели </w:t>
+        <w:t xml:space="preserve">Влияние </w:t>
+      </w:r>
+      <w:r>
+        <w:rPr>
+          <w:rFonts w:ascii="Times New Roman" w:hAnsi="Times New Roman" w:cs="Times New Roman"/>
+          <w:lang w:val="ru-RU"/>
+        </w:rPr>
+        <w:t>объема передаваемы</w:t>
+      </w:r>
+      <w:r>
+        <w:rPr>
+          <w:rFonts w:ascii="Times New Roman" w:hAnsi="Times New Roman" w:cs="Times New Roman"/>
+          <w:lang w:val="ru-RU"/>
+        </w:rPr>
+        <w:t>х</w:t>
+      </w:r>
+      <w:r>
+        <w:rPr>
+          <w:rFonts w:ascii="Times New Roman" w:hAnsi="Times New Roman" w:cs="Times New Roman"/>
+          <w:lang w:val="ru-RU"/>
+        </w:rPr>
+        <w:t xml:space="preserve"> данных</w:t>
+      </w:r>
+      <w:r>
+        <w:rPr>
+          <w:rFonts w:ascii="Times New Roman" w:hAnsi="Times New Roman" w:cs="Times New Roman"/>
+          <w:lang w:val="ru-RU"/>
+        </w:rPr>
+        <w:t xml:space="preserve"> на качество </w:t>
+      </w:r>
+      <w:r>
+        <w:rPr>
+          <w:rFonts w:ascii="Times New Roman" w:hAnsi="Times New Roman" w:cs="Times New Roman"/>
+          <w:lang w:val="ru-RU"/>
+        </w:rPr>
+        <w:t>работы метода</w:t>
+      </w:r>
+    </w:p>
+    <w:p>
+      <w:pPr>
+        <w:spacing w:after="0"/>
+        <w:rPr>
+          <w:rFonts w:ascii="Times New Roman" w:hAnsi="Times New Roman" w:cs="Times New Roman"/>
+          <w:lang w:val="ru-RU"/>
+        </w:rPr>
+      </w:pPr>
+      <w:r>
+        <w:rPr>
+          <w:rFonts w:ascii="Times New Roman" w:hAnsi="Times New Roman" w:cs="Times New Roman"/>
+          <w:lang w:val="ru-RU"/>
+        </w:rPr>
+        <w:t>4.</w:t>
+      </w:r>
+      <w:r>
+        <w:rPr>
+          <w:rFonts w:ascii="Times New Roman" w:hAnsi="Times New Roman" w:cs="Times New Roman"/>
+          <w:lang w:val="ru-RU"/>
+        </w:rPr>
+        <w:t>5</w:t>
+      </w:r>
+      <w:r>
+        <w:rPr>
+          <w:rFonts w:ascii="Times New Roman" w:hAnsi="Times New Roman" w:cs="Times New Roman"/>
+          <w:lang w:val="ru-RU"/>
+        </w:rPr>
+        <w:t xml:space="preserve">. </w:t>
+      </w:r>
+      <w:r>
+        <w:rPr>
+          <w:rFonts w:ascii="Times New Roman" w:hAnsi="Times New Roman" w:cs="Times New Roman"/>
+          <w:lang w:val="ru-RU"/>
+        </w:rPr>
+        <w:t xml:space="preserve">Влияние качества изображения на качество </w:t>
+      </w:r>
+      <w:r>
+        <w:rPr>
+          <w:rFonts w:ascii="Times New Roman" w:hAnsi="Times New Roman" w:cs="Times New Roman"/>
+          <w:lang w:val="ru-RU"/>
+        </w:rPr>
+        <w:t>работы метода</w:t>
       </w:r>
     </w:p>
     <w:p>

</xml_diff>